<commit_message>
- Fixing loading UX - Changing the invoice template slightly with more space for employee info
</commit_message>
<xml_diff>
--- a/docs/templates/us_invoice_template.docx
+++ b/docs/templates/us_invoice_template.docx
@@ -12,14 +12,34 @@
       <w:r>
         <w:t xml:space="preserve"> </w:t>
       </w:r>
+      <w:proofErr w:type="gramStart"/>
       <w:r>
         <w:rPr>
           <w:b/>
           <w:bCs/>
           <w:color w:val="4F81BD" w:themeColor="accent1"/>
         </w:rPr>
-        <w:t>{{ invoice_</w:t>
+        <w:t xml:space="preserve">{{ </w:t>
       </w:r>
+      <w:proofErr w:type="spellStart"/>
+      <w:r>
+        <w:rPr>
+          <w:b/>
+          <w:bCs/>
+          <w:color w:val="4F81BD" w:themeColor="accent1"/>
+        </w:rPr>
+        <w:t>invoice</w:t>
+      </w:r>
+      <w:proofErr w:type="gramEnd"/>
+      <w:r>
+        <w:rPr>
+          <w:b/>
+          <w:bCs/>
+          <w:color w:val="4F81BD" w:themeColor="accent1"/>
+        </w:rPr>
+        <w:t>_</w:t>
+      </w:r>
+      <w:proofErr w:type="gramStart"/>
       <w:r>
         <w:rPr>
           <w:b/>
@@ -28,13 +48,23 @@
         </w:rPr>
         <w:t>number</w:t>
       </w:r>
+      <w:proofErr w:type="spellEnd"/>
       <w:r>
         <w:rPr>
           <w:b/>
           <w:bCs/>
           <w:color w:val="4F81BD" w:themeColor="accent1"/>
         </w:rPr>
-        <w:t xml:space="preserve"> }}</w:t>
+        <w:t xml:space="preserve"> }</w:t>
+      </w:r>
+      <w:proofErr w:type="gramEnd"/>
+      <w:r>
+        <w:rPr>
+          <w:b/>
+          <w:bCs/>
+          <w:color w:val="4F81BD" w:themeColor="accent1"/>
+        </w:rPr>
+        <w:t>}</w:t>
       </w:r>
     </w:p>
     <w:tbl>
@@ -52,13 +82,13 @@
         <w:tblLook w:val="04A0" w:firstRow="1" w:lastRow="0" w:firstColumn="1" w:lastColumn="0" w:noHBand="0" w:noVBand="1"/>
       </w:tblPr>
       <w:tblGrid>
-        <w:gridCol w:w="4788"/>
-        <w:gridCol w:w="4788"/>
+        <w:gridCol w:w="6570"/>
+        <w:gridCol w:w="3006"/>
       </w:tblGrid>
       <w:tr>
         <w:tc>
           <w:tcPr>
-            <w:tcW w:w="4788" w:type="dxa"/>
+            <w:tcW w:w="6570" w:type="dxa"/>
           </w:tcPr>
           <w:p>
             <w:pPr>
@@ -69,12 +99,15 @@
             </w:r>
           </w:p>
           <w:p>
+            <w:proofErr w:type="gramStart"/>
             <w:r>
               <w:t xml:space="preserve">{{ </w:t>
             </w:r>
+            <w:proofErr w:type="spellStart"/>
             <w:r>
               <w:t>employee</w:t>
             </w:r>
+            <w:proofErr w:type="gramEnd"/>
             <w:r>
               <w:t>_</w:t>
             </w:r>
@@ -84,17 +117,24 @@
             <w:r>
               <w:t>_</w:t>
             </w:r>
+            <w:proofErr w:type="gramStart"/>
             <w:r>
               <w:t>name</w:t>
             </w:r>
+            <w:proofErr w:type="spellEnd"/>
             <w:r>
               <w:t xml:space="preserve"> </w:t>
             </w:r>
             <w:r>
-              <w:t>}}</w:t>
-            </w:r>
-          </w:p>
-          <w:p>
+              <w:t>}</w:t>
+            </w:r>
+            <w:proofErr w:type="gramEnd"/>
+            <w:r>
+              <w:t>}</w:t>
+            </w:r>
+          </w:p>
+          <w:p>
+            <w:proofErr w:type="gramStart"/>
             <w:r>
               <w:t>{{</w:t>
             </w:r>
@@ -105,25 +145,38 @@
               <w:t>a</w:t>
             </w:r>
             <w:r>
-              <w:t>ddress_</w:t>
+              <w:t>ddress</w:t>
+            </w:r>
+            <w:proofErr w:type="gramEnd"/>
+            <w:r>
+              <w:t>_</w:t>
             </w:r>
             <w:r>
               <w:t>l</w:t>
             </w:r>
             <w:r>
-              <w:t>ine_1</w:t>
+              <w:t>ine_</w:t>
+            </w:r>
+            <w:proofErr w:type="gramStart"/>
+            <w:r>
+              <w:t>1</w:t>
             </w:r>
             <w:r>
               <w:t xml:space="preserve"> </w:t>
             </w:r>
             <w:r>
-              <w:t>}}</w:t>
+              <w:t>}</w:t>
+            </w:r>
+            <w:proofErr w:type="gramEnd"/>
+            <w:r>
+              <w:t>}</w:t>
             </w:r>
             <w:r>
               <w:t>,</w:t>
             </w:r>
           </w:p>
           <w:p>
+            <w:proofErr w:type="gramStart"/>
             <w:r>
               <w:t>{{</w:t>
             </w:r>
@@ -134,19 +187,31 @@
               <w:t>a</w:t>
             </w:r>
             <w:r>
-              <w:t>ddress_</w:t>
+              <w:t>ddress</w:t>
+            </w:r>
+            <w:proofErr w:type="gramEnd"/>
+            <w:r>
+              <w:t>_</w:t>
             </w:r>
             <w:r>
               <w:t>l</w:t>
             </w:r>
             <w:r>
-              <w:t>ine_2</w:t>
+              <w:t>ine_</w:t>
+            </w:r>
+            <w:proofErr w:type="gramStart"/>
+            <w:r>
+              <w:t>2</w:t>
             </w:r>
             <w:r>
               <w:t xml:space="preserve"> </w:t>
             </w:r>
             <w:r>
-              <w:t>}}</w:t>
+              <w:t>}</w:t>
+            </w:r>
+            <w:proofErr w:type="gramEnd"/>
+            <w:r>
+              <w:t>}</w:t>
             </w:r>
             <w:r>
               <w:t>,</w:t>
@@ -188,7 +253,7 @@
         </w:tc>
         <w:tc>
           <w:tcPr>
-            <w:tcW w:w="4788" w:type="dxa"/>
+            <w:tcW w:w="3006" w:type="dxa"/>
           </w:tcPr>
           <w:p>
             <w:pPr>
@@ -212,23 +277,35 @@
             </w:r>
           </w:p>
           <w:p>
+            <w:proofErr w:type="gramStart"/>
             <w:r>
               <w:t>{{</w:t>
             </w:r>
             <w:r>
               <w:t xml:space="preserve"> </w:t>
             </w:r>
-            <w:r>
-              <w:t>invoice_</w:t>
-            </w:r>
+            <w:proofErr w:type="spellStart"/>
+            <w:r>
+              <w:t>invoice</w:t>
+            </w:r>
+            <w:proofErr w:type="gramEnd"/>
+            <w:r>
+              <w:t>_</w:t>
+            </w:r>
+            <w:proofErr w:type="gramStart"/>
             <w:r>
               <w:t>date</w:t>
             </w:r>
+            <w:proofErr w:type="spellEnd"/>
             <w:r>
               <w:t xml:space="preserve"> </w:t>
             </w:r>
             <w:r>
-              <w:t>}}</w:t>
+              <w:t>}</w:t>
+            </w:r>
+            <w:proofErr w:type="gramEnd"/>
+            <w:r>
+              <w:t>}</w:t>
             </w:r>
           </w:p>
           <w:p>
@@ -321,23 +398,32 @@
             <w:gridSpan w:val="2"/>
           </w:tcPr>
           <w:p>
+            <w:proofErr w:type="gramStart"/>
             <w:r>
               <w:t>{{</w:t>
             </w:r>
             <w:r>
               <w:t xml:space="preserve"> </w:t>
             </w:r>
+            <w:proofErr w:type="spellStart"/>
             <w:r>
               <w:t>current</w:t>
             </w:r>
+            <w:proofErr w:type="gramEnd"/>
             <w:r>
               <w:t>_</w:t>
             </w:r>
+            <w:proofErr w:type="gramStart"/>
             <w:r>
               <w:t>month</w:t>
             </w:r>
-            <w:r>
-              <w:t xml:space="preserve"> }} Consultant Fees</w:t>
+            <w:proofErr w:type="spellEnd"/>
+            <w:r>
+              <w:t xml:space="preserve"> }</w:t>
+            </w:r>
+            <w:proofErr w:type="gramEnd"/>
+            <w:r>
+              <w:t>} Consultant Fees</w:t>
             </w:r>
           </w:p>
         </w:tc>
@@ -362,12 +448,14 @@
               <w:jc w:val="right"/>
               <w:cnfStyle w:val="000000100000" w:firstRow="0" w:lastRow="0" w:firstColumn="0" w:lastColumn="0" w:oddVBand="0" w:evenVBand="0" w:oddHBand="1" w:evenHBand="0" w:firstRowFirstColumn="0" w:firstRowLastColumn="0" w:lastRowFirstColumn="0" w:lastRowLastColumn="0"/>
             </w:pPr>
+            <w:proofErr w:type="gramStart"/>
             <w:r>
               <w:t xml:space="preserve">{{ </w:t>
             </w:r>
             <w:r>
               <w:t>amount</w:t>
             </w:r>
+            <w:proofErr w:type="gramEnd"/>
             <w:r>
               <w:t xml:space="preserve"> }}</w:t>
             </w:r>
@@ -393,6 +481,7 @@
       <w:r>
         <w:tab/>
       </w:r>
+      <w:proofErr w:type="gramStart"/>
       <w:r>
         <w:t>{{</w:t>
       </w:r>
@@ -402,6 +491,7 @@
       <w:r>
         <w:t>amount</w:t>
       </w:r>
+      <w:proofErr w:type="gramEnd"/>
       <w:r>
         <w:t xml:space="preserve"> </w:t>
       </w:r>

</xml_diff>